<commit_message>
sub sections in process book
</commit_message>
<xml_diff>
--- a/Documentation/Steaming_Dev_Gossip_Design_Process_Book.docx
+++ b/Documentation/Steaming_Dev_Gossip_Design_Process_Book.docx
@@ -15,6 +15,7 @@
       <w:r>
         <w:rPr>
           <w:rFonts w:ascii="Impact" w:hAnsi="Impact"/>
+          <w:noProof/>
           <w:color w:val="121214"/>
           <w:sz w:val="56"/>
         </w:rPr>
@@ -429,20 +430,57 @@
     </w:p>
     <w:p>
       <w:pPr>
-        <w:keepNext/>
-        <w:spacing w:before="480" w:after="160"/>
-        <w:rPr>
-          <w:rFonts w:ascii="TALERO" w:hAnsi="TALERO"/>
-        </w:rPr>
+        <w:pStyle w:val="Title2"/>
       </w:pPr>
       <w:r>
-        <w:rPr>
-          <w:rFonts w:ascii="TALERO" w:hAnsi="TALERO"/>
-          <w:color w:val="A855F7"/>
-          <w:sz w:val="48"/>
-        </w:rPr>
         <w:lastRenderedPageBreak/>
-        <w:t>02 / UI COMPONENT MAPPING</w:t>
+        <w:t>02 / Key Questions</w:t>
+      </w:r>
+    </w:p>
+    <w:p>
+      <w:pPr>
+        <w:pStyle w:val="Title2"/>
+      </w:pPr>
+      <w:r>
+        <w:t>03 / Process</w:t>
+      </w:r>
+    </w:p>
+    <w:p>
+      <w:pPr>
+        <w:pStyle w:val="Title2"/>
+      </w:pPr>
+      <w:r>
+        <w:t>04 / Dataset Summary</w:t>
+      </w:r>
+    </w:p>
+    <w:p>
+      <w:pPr>
+        <w:pStyle w:val="Title2"/>
+      </w:pPr>
+      <w:r>
+        <w:t xml:space="preserve">05 / Preprocessing </w:t>
+      </w:r>
+    </w:p>
+    <w:p>
+      <w:pPr>
+        <w:pStyle w:val="Title2"/>
+      </w:pPr>
+      <w:r>
+        <w:t>06 / EDA and Insights</w:t>
+      </w:r>
+    </w:p>
+    <w:p>
+      <w:pPr>
+        <w:pStyle w:val="Title2"/>
+      </w:pPr>
+      <w:r>
+        <w:t>0</w:t>
+      </w:r>
+      <w:r>
+        <w:t>7</w:t>
+      </w:r>
+      <w:r>
+        <w:t xml:space="preserve"> / UI COMPONENT MAPPING</w:t>
       </w:r>
     </w:p>
     <w:p>
@@ -566,6 +604,7 @@
           <w:rFonts w:ascii="TT Octosquares Trial" w:hAnsi="TT Octosquares Trial"/>
         </w:rPr>
       </w:pPr>
+      <w:proofErr w:type="gramStart"/>
       <w:r>
         <w:rPr>
           <w:rFonts w:ascii="Times New Roman" w:hAnsi="Times New Roman" w:cs="Times New Roman"/>
@@ -580,45 +619,103 @@
           <w:b/>
           <w:color w:val="A855F7"/>
         </w:rPr>
-        <w:t xml:space="preserve">  Taxonomy &amp; Tag Arrays: </w:t>
+        <w:t xml:space="preserve">  Taxonomy</w:t>
+      </w:r>
+      <w:proofErr w:type="gramEnd"/>
+      <w:r>
+        <w:rPr>
+          <w:rFonts w:ascii="TT Octosquares Trial" w:hAnsi="TT Octosquares Trial"/>
+          <w:b/>
+          <w:color w:val="A855F7"/>
+        </w:rPr>
+        <w:t xml:space="preserve"> &amp; Tag Arrays</w:t>
+      </w:r>
+      <w:proofErr w:type="gramStart"/>
+      <w:r>
+        <w:rPr>
+          <w:rFonts w:ascii="TT Octosquares Trial" w:hAnsi="TT Octosquares Trial"/>
+          <w:b/>
+          <w:color w:val="A855F7"/>
+        </w:rPr>
+        <w:t xml:space="preserve">: </w:t>
       </w:r>
       <w:r>
         <w:rPr>
           <w:rFonts w:ascii="TT Octosquares Trial" w:hAnsi="TT Octosquares Trial"/>
           <w:color w:val="27272A"/>
         </w:rPr>
-        <w:t xml:space="preserve"> Uses distinct capsule design treatments for genres and player tags, offering intuitive visual anchors for taxonomy discovery.</w:t>
+        <w:t xml:space="preserve"> Uses</w:t>
       </w:r>
-    </w:p>
-    <w:p>
-      <w:pPr>
-        <w:spacing w:after="240"/>
-      </w:pPr>
+      <w:proofErr w:type="gramEnd"/>
+      <w:r>
+        <w:rPr>
+          <w:rFonts w:ascii="TT Octosquares Trial" w:hAnsi="TT Octosquares Trial"/>
+          <w:color w:val="27272A"/>
+        </w:rPr>
+        <w:t xml:space="preserve"> distinct capsule design treatments for genres and player tags, offering intuitive visual anchors for taxonomy discovery.</w:t>
+      </w:r>
     </w:p>
     <w:p>
       <w:pPr>
         <w:pStyle w:val="Title2"/>
       </w:pPr>
       <w:r>
-        <w:t>03 / INTERFACE WIREFRAMES</w:t>
+        <w:lastRenderedPageBreak/>
+        <w:t>0</w:t>
+      </w:r>
+      <w:r>
+        <w:t xml:space="preserve">8 </w:t>
+      </w:r>
+      <w:r>
+        <w:t>/ INTERFACE WIREFRAMES</w:t>
       </w:r>
     </w:p>
     <w:p>
       <w:pPr>
-        <w:keepNext/>
-        <w:spacing w:before="480" w:after="160"/>
-        <w:rPr>
-          <w:rFonts w:ascii="TALERO" w:hAnsi="TALERO"/>
-        </w:rPr>
+        <w:pStyle w:val="Title2"/>
       </w:pPr>
       <w:r>
+        <w:t xml:space="preserve">09 / Final Visualizations </w:t>
+      </w:r>
+    </w:p>
+    <w:p>
+      <w:pPr>
+        <w:pStyle w:val="Title2"/>
+      </w:pPr>
+      <w:r>
+        <w:t xml:space="preserve">10 / Challenges </w:t>
+      </w:r>
+    </w:p>
+    <w:p>
+      <w:pPr>
+        <w:pStyle w:val="Title2"/>
+      </w:pPr>
+      <w:r>
+        <w:t xml:space="preserve">11 / Peer Assessment </w:t>
+      </w:r>
+    </w:p>
+    <w:p>
+      <w:pPr>
+        <w:pStyle w:val="Title2"/>
+      </w:pPr>
+      <w:r>
+        <w:t>1</w:t>
+      </w:r>
+      <w:r>
+        <w:t>2</w:t>
+      </w:r>
+      <w:r>
+        <w:t xml:space="preserve"> / Final Reflections</w:t>
+      </w:r>
+    </w:p>
+    <w:p>
+      <w:pPr>
         <w:rPr>
-          <w:rFonts w:ascii="TALERO" w:hAnsi="TALERO"/>
+          <w:rFonts w:ascii="Calibri" w:hAnsi="Calibri" w:cs="Calibri"/>
           <w:color w:val="A855F7"/>
           <w:sz w:val="48"/>
         </w:rPr>
-        <w:t>04 / PRODUCTION SPECIFICATIONS</w:t>
-      </w:r>
+      </w:pPr>
     </w:p>
     <w:p/>
     <w:sectPr>

</xml_diff>